<commit_message>
Auto-upload WeChat shipping after live pay; refresh soft-copyright drafts.
Co-authored-by: Cursor <cursoragent@cursor.com>
</commit_message>
<xml_diff>
--- a/软件著作/码间校园市集系统V1.0 使用说明书.docx
+++ b/软件著作/码间校园市集系统V1.0 使用说明书.docx
@@ -774,6 +774,189 @@
         <w:t>本软件名称为码间校园市集系统V1.0，著作权人：甘南县码间软件开发工作室。未经著作权人书面许可，不得擅自复制、修改、传播本软件的程序与文档鉴别材料用于商业登记以外的用途。</w:t>
       </w:r>
     </w:p>
+    <w:p>
+      <w:r>
+        <w:br w:type="page"/>
+      </w:r>
+    </w:p>
+    <w:p>
+      <w:pPr>
+        <w:pStyle w:val="Heading1"/>
+      </w:pPr>
+      <w:r>
+        <w:t>附录 A 说明书截图粘贴指引</w:t>
+      </w:r>
+    </w:p>
+    <w:p>
+      <w:r>
+        <w:t>以下截图按功能顺序粘贴到第 2 章对应小节之后。截图须为完整界面。软件界面名称与采集表保持一致：码间校园市集系统（简称校园市集）。著作权人：甘南县码间软件开发工作室。说明书中除著作权人外不出现其他个人姓名。</w:t>
+      </w:r>
+    </w:p>
+    <w:p>
+      <w:pPr>
+        <w:pStyle w:val="ListNumber"/>
+      </w:pPr>
+      <w:r>
+        <w:t>图1 系统登录界面（对应 2.1）— 文件：说明书截图/01-登录.png</w:t>
+      </w:r>
+    </w:p>
+    <w:p>
+      <w:pPr>
+        <w:pStyle w:val="ListNumber"/>
+      </w:pPr>
+      <w:r>
+        <w:t>图2 系统注册界面（对应 2.1）— 文件：说明书截图/02-注册.png</w:t>
+      </w:r>
+    </w:p>
+    <w:p>
+      <w:pPr>
+        <w:pStyle w:val="ListNumber"/>
+      </w:pPr>
+      <w:r>
+        <w:t>图3 系统首页（对应 2.1～2.2）— 文件：说明书截图/03-首页.png</w:t>
+      </w:r>
+    </w:p>
+    <w:p>
+      <w:pPr>
+        <w:pStyle w:val="ListNumber"/>
+      </w:pPr>
+      <w:r>
+        <w:t>图4 闲置商品列表（对应 2.2）— 文件：说明书截图/04-商品列表.png</w:t>
+      </w:r>
+    </w:p>
+    <w:p>
+      <w:pPr>
+        <w:pStyle w:val="ListNumber"/>
+      </w:pPr>
+      <w:r>
+        <w:t>图5 商品详情（对应 2.2）— 文件：说明书截图/05-商品详情.png</w:t>
+      </w:r>
+    </w:p>
+    <w:p>
+      <w:pPr>
+        <w:pStyle w:val="ListNumber"/>
+      </w:pPr>
+      <w:r>
+        <w:t>图6 发布闲置（对应 2.3）— 文件：说明书截图/06-发布闲置.png</w:t>
+      </w:r>
+    </w:p>
+    <w:p>
+      <w:pPr>
+        <w:pStyle w:val="ListNumber"/>
+      </w:pPr>
+      <w:r>
+        <w:t>图7 购物车（对应 2.4）— 文件：说明书截图/07-购物车.png</w:t>
+      </w:r>
+    </w:p>
+    <w:p>
+      <w:pPr>
+        <w:pStyle w:val="ListNumber"/>
+      </w:pPr>
+      <w:r>
+        <w:t>图8 订单列表（对应 2.4）— 文件：说明书截图/08-订单列表.png</w:t>
+      </w:r>
+    </w:p>
+    <w:p>
+      <w:pPr>
+        <w:pStyle w:val="ListNumber"/>
+      </w:pPr>
+      <w:r>
+        <w:t>图9 在线支付（对应 2.4）— 文件：说明书截图/09-支付弹窗.png</w:t>
+      </w:r>
+    </w:p>
+    <w:p>
+      <w:pPr>
+        <w:pStyle w:val="ListNumber"/>
+      </w:pPr>
+      <w:r>
+        <w:t>图10 收货地址（对应 2.8）— 文件：说明书截图/10-收货地址.png</w:t>
+      </w:r>
+    </w:p>
+    <w:p>
+      <w:pPr>
+        <w:pStyle w:val="ListNumber"/>
+      </w:pPr>
+      <w:r>
+        <w:t>图11 消息列表（对应 2.5）— 文件：说明书截图/11-聊天列表.png</w:t>
+      </w:r>
+    </w:p>
+    <w:p>
+      <w:pPr>
+        <w:pStyle w:val="ListNumber"/>
+      </w:pPr>
+      <w:r>
+        <w:t>图12 聊天室（对应 2.5）— 文件：说明书截图/12-聊天室.png</w:t>
+      </w:r>
+    </w:p>
+    <w:p>
+      <w:pPr>
+        <w:pStyle w:val="ListNumber"/>
+      </w:pPr>
+      <w:r>
+        <w:t>图13 校园跑腿（对应 2.6）— 文件：说明书截图/13-跑腿首页.png</w:t>
+      </w:r>
+    </w:p>
+    <w:p>
+      <w:pPr>
+        <w:pStyle w:val="ListNumber"/>
+      </w:pPr>
+      <w:r>
+        <w:t>图14 接单大厅（对应 2.6）— 文件：说明书截图/14-接单大厅.png</w:t>
+      </w:r>
+    </w:p>
+    <w:p>
+      <w:pPr>
+        <w:pStyle w:val="ListNumber"/>
+      </w:pPr>
+      <w:r>
+        <w:t>图15 简历创作（对应 2.7）— 文件：说明书截图/15-简历创作.png</w:t>
+      </w:r>
+    </w:p>
+    <w:p>
+      <w:pPr>
+        <w:pStyle w:val="ListNumber"/>
+      </w:pPr>
+      <w:r>
+        <w:t>图16 个人中心（对应 2.8）— 文件：说明书截图/16-个人中心.png</w:t>
+      </w:r>
+    </w:p>
+    <w:p>
+      <w:pPr>
+        <w:pStyle w:val="ListNumber"/>
+      </w:pPr>
+      <w:r>
+        <w:t>图17 学生认证（对应 2.8）— 文件：说明书截图/17-学生认证.png</w:t>
+      </w:r>
+    </w:p>
+    <w:p>
+      <w:pPr>
+        <w:pStyle w:val="ListNumber"/>
+      </w:pPr>
+      <w:r>
+        <w:t>图18 小程序首页（对应 2.1）— 文件：说明书截图/18-小程序首页.png</w:t>
+      </w:r>
+    </w:p>
+    <w:p>
+      <w:pPr>
+        <w:pStyle w:val="ListNumber"/>
+      </w:pPr>
+      <w:r>
+        <w:t>图19 小程序登录（对应 2.1）— 文件：说明书截图/19-小程序登录.png</w:t>
+      </w:r>
+    </w:p>
+    <w:p>
+      <w:pPr>
+        <w:pStyle w:val="ListNumber"/>
+      </w:pPr>
+      <w:r>
+        <w:t>图20 管理后台（对应 2.9）— 文件：说明书截图/20-管理后台.png</w:t>
+      </w:r>
+    </w:p>
+    <w:p>
+      <w:r>
+        <w:t>操作提示：请用浏览器或微信开发者工具打开正式环境 https://xymarket.cn / 小程序，按上表截取整屏图片，保存到「软件著作/说明书截图/」后，插入本说明书第 2 章对应位置。详细步骤见同目录《说明书截图清单.md》。</w:t>
+      </w:r>
+    </w:p>
     <w:sectPr>
       <w:pgSz w:w="11906" w:h="16838"/>
       <w:pgMar w:top="1417" w:right="1417" w:bottom="1417" w:left="1417" w:header="720" w:footer="720" w:gutter="0"/>

</xml_diff>